<commit_message>
Added a lot of things like Dart VM mistake fix and websockets understanding
</commit_message>
<xml_diff>
--- a/f19_flutter_responsive_ui.docx
+++ b/f19_flutter_responsive_ui.docx
@@ -61,7 +61,30 @@
           <w:sz w:val="36"/>
           <w:szCs w:val="36"/>
         </w:rPr>
-        <w:t>Widget………………………………………2</w:t>
+        <w:t>Widget……………………………………</w:t>
+      </w:r>
+      <w:proofErr w:type="gramStart"/>
+      <w:r>
+        <w:rPr>
+          <w:sz w:val="36"/>
+          <w:szCs w:val="36"/>
+        </w:rPr>
+        <w:t>…</w:t>
+      </w:r>
+      <w:r>
+        <w:rPr>
+          <w:sz w:val="36"/>
+          <w:szCs w:val="36"/>
+        </w:rPr>
+        <w:t>..</w:t>
+      </w:r>
+      <w:proofErr w:type="gramEnd"/>
+      <w:r>
+        <w:rPr>
+          <w:sz w:val="36"/>
+          <w:szCs w:val="36"/>
+        </w:rPr>
+        <w:t>2</w:t>
       </w:r>
     </w:p>
     <w:p>
@@ -97,7 +120,21 @@
           <w:sz w:val="36"/>
           <w:szCs w:val="36"/>
         </w:rPr>
-        <w:t>………………………………………………….7</w:t>
+        <w:t>…………………………………………………</w:t>
+      </w:r>
+      <w:r>
+        <w:rPr>
+          <w:sz w:val="36"/>
+          <w:szCs w:val="36"/>
+        </w:rPr>
+        <w:t>…</w:t>
+      </w:r>
+      <w:r>
+        <w:rPr>
+          <w:sz w:val="36"/>
+          <w:szCs w:val="36"/>
+        </w:rPr>
+        <w:t>7</w:t>
       </w:r>
     </w:p>
     <w:p>
@@ -119,7 +156,28 @@
           <w:sz w:val="36"/>
           <w:szCs w:val="36"/>
         </w:rPr>
-        <w:t>Orientation Lock……………………………………………12</w:t>
+        <w:t>Orientation Lock……………………………………………</w:t>
+      </w:r>
+      <w:r>
+        <w:rPr>
+          <w:sz w:val="36"/>
+          <w:szCs w:val="36"/>
+        </w:rPr>
+        <w:t>.</w:t>
+      </w:r>
+      <w:r>
+        <w:rPr>
+          <w:sz w:val="36"/>
+          <w:szCs w:val="36"/>
+        </w:rPr>
+        <w:t>1</w:t>
+      </w:r>
+      <w:r>
+        <w:rPr>
+          <w:sz w:val="36"/>
+          <w:szCs w:val="36"/>
+        </w:rPr>
+        <w:t>4</w:t>
       </w:r>
     </w:p>
     <w:p>
@@ -175,7 +233,14 @@
           <w:sz w:val="36"/>
           <w:szCs w:val="36"/>
         </w:rPr>
-        <w:t>…………………………………………….15</w:t>
+        <w:t>…………………………………………….</w:t>
+      </w:r>
+      <w:r>
+        <w:rPr>
+          <w:sz w:val="36"/>
+          <w:szCs w:val="36"/>
+        </w:rPr>
+        <w:t>17</w:t>
       </w:r>
     </w:p>
     <w:p>
@@ -197,7 +262,14 @@
           <w:sz w:val="36"/>
           <w:szCs w:val="36"/>
         </w:rPr>
-        <w:t>Adaptive Design…………………………………………….16</w:t>
+        <w:t>Adaptive Design…………………………………………….1</w:t>
+      </w:r>
+      <w:r>
+        <w:rPr>
+          <w:sz w:val="36"/>
+          <w:szCs w:val="36"/>
+        </w:rPr>
+        <w:t>8</w:t>
       </w:r>
     </w:p>
     <w:p>
@@ -230,23 +302,28 @@
           <w:sz w:val="36"/>
           <w:szCs w:val="36"/>
         </w:rPr>
-        <w:t>……………………………………….…</w:t>
-      </w:r>
-      <w:proofErr w:type="gramStart"/>
-      <w:r>
-        <w:rPr>
-          <w:sz w:val="36"/>
-          <w:szCs w:val="36"/>
-        </w:rPr>
-        <w:t>…..</w:t>
-      </w:r>
-      <w:proofErr w:type="gramEnd"/>
-      <w:r>
-        <w:rPr>
-          <w:sz w:val="36"/>
-          <w:szCs w:val="36"/>
-        </w:rPr>
-        <w:t>17</w:t>
+        <w:t>……………………………………….……</w:t>
+      </w:r>
+      <w:r>
+        <w:rPr>
+          <w:sz w:val="36"/>
+          <w:szCs w:val="36"/>
+        </w:rPr>
+        <w:t>…</w:t>
+      </w:r>
+      <w:r>
+        <w:rPr>
+          <w:sz w:val="36"/>
+          <w:szCs w:val="36"/>
+        </w:rPr>
+        <w:t>1</w:t>
+      </w:r>
+      <w:r>
+        <w:rPr>
+          <w:sz w:val="36"/>
+          <w:szCs w:val="36"/>
+        </w:rPr>
+        <w:t>9</w:t>
       </w:r>
     </w:p>
     <w:p>
@@ -279,7 +356,14 @@
           <w:sz w:val="36"/>
           <w:szCs w:val="36"/>
         </w:rPr>
-        <w:t xml:space="preserve"> Package………………………………20</w:t>
+        <w:t xml:space="preserve"> Package………………………………</w:t>
+      </w:r>
+      <w:r>
+        <w:rPr>
+          <w:sz w:val="36"/>
+          <w:szCs w:val="36"/>
+        </w:rPr>
+        <w:t>22</w:t>
       </w:r>
     </w:p>
     <w:p>
@@ -7353,14 +7437,7 @@
           <w:sz w:val="36"/>
           <w:szCs w:val="36"/>
         </w:rPr>
-        <w:t xml:space="preserve"> </w:t>
-      </w:r>
-      <w:r>
-        <w:rPr>
-          <w:sz w:val="36"/>
-          <w:szCs w:val="36"/>
-        </w:rPr>
-        <w:t xml:space="preserve">(prefer </w:t>
+        <w:t xml:space="preserve"> (prefer </w:t>
       </w:r>
       <w:proofErr w:type="spellStart"/>
       <w:r>
@@ -9053,6 +9130,742 @@
           <w:szCs w:val="36"/>
         </w:rPr>
         <w:t xml:space="preserve"> depend on parent size.</w:t>
+      </w:r>
+    </w:p>
+    <w:p>
+      <w:pPr>
+        <w:jc w:val="both"/>
+        <w:rPr>
+          <w:sz w:val="36"/>
+          <w:szCs w:val="36"/>
+        </w:rPr>
+      </w:pPr>
+    </w:p>
+    <w:p>
+      <w:pPr>
+        <w:jc w:val="both"/>
+        <w:rPr>
+          <w:sz w:val="36"/>
+          <w:szCs w:val="36"/>
+        </w:rPr>
+      </w:pPr>
+      <w:proofErr w:type="spellStart"/>
+      <w:r>
+        <w:rPr>
+          <w:sz w:val="36"/>
+          <w:szCs w:val="36"/>
+        </w:rPr>
+        <w:t>MediaQuery.of</w:t>
+      </w:r>
+      <w:proofErr w:type="spellEnd"/>
+      <w:r>
+        <w:rPr>
+          <w:sz w:val="36"/>
+          <w:szCs w:val="36"/>
+        </w:rPr>
+        <w:t>(</w:t>
+      </w:r>
+      <w:r>
+        <w:rPr>
+          <w:sz w:val="36"/>
+          <w:szCs w:val="36"/>
+        </w:rPr>
+        <w:t>…</w:t>
+      </w:r>
+      <w:proofErr w:type="gramStart"/>
+      <w:r>
+        <w:rPr>
+          <w:sz w:val="36"/>
+          <w:szCs w:val="36"/>
+        </w:rPr>
+        <w:t>).</w:t>
+      </w:r>
+      <w:proofErr w:type="spellStart"/>
+      <w:r>
+        <w:rPr>
+          <w:sz w:val="36"/>
+          <w:szCs w:val="36"/>
+        </w:rPr>
+        <w:t>viewInsets</w:t>
+      </w:r>
+      <w:proofErr w:type="spellEnd"/>
+      <w:proofErr w:type="gramEnd"/>
+      <w:r>
+        <w:rPr>
+          <w:sz w:val="36"/>
+          <w:szCs w:val="36"/>
+        </w:rPr>
+        <w:t xml:space="preserve"> (Detect Keyboard Visibility Globally):</w:t>
+      </w:r>
+    </w:p>
+    <w:p>
+      <w:pPr>
+        <w:jc w:val="both"/>
+        <w:rPr>
+          <w:sz w:val="36"/>
+          <w:szCs w:val="36"/>
+        </w:rPr>
+      </w:pPr>
+      <w:r>
+        <w:rPr>
+          <w:sz w:val="36"/>
+          <w:szCs w:val="36"/>
+        </w:rPr>
+        <w:t xml:space="preserve"># If we want to know is the keyboard open anywhere in the ap, we use </w:t>
+      </w:r>
+      <w:proofErr w:type="spellStart"/>
+      <w:r>
+        <w:rPr>
+          <w:b/>
+          <w:bCs/>
+          <w:sz w:val="36"/>
+          <w:szCs w:val="36"/>
+        </w:rPr>
+        <w:t>MediaQuery.of</w:t>
+      </w:r>
+      <w:proofErr w:type="spellEnd"/>
+      <w:r>
+        <w:rPr>
+          <w:b/>
+          <w:bCs/>
+          <w:sz w:val="36"/>
+          <w:szCs w:val="36"/>
+        </w:rPr>
+        <w:t>(context</w:t>
+      </w:r>
+      <w:proofErr w:type="gramStart"/>
+      <w:r>
+        <w:rPr>
+          <w:b/>
+          <w:bCs/>
+          <w:sz w:val="36"/>
+          <w:szCs w:val="36"/>
+        </w:rPr>
+        <w:t>).</w:t>
+      </w:r>
+      <w:proofErr w:type="spellStart"/>
+      <w:r>
+        <w:rPr>
+          <w:b/>
+          <w:bCs/>
+          <w:sz w:val="36"/>
+          <w:szCs w:val="36"/>
+        </w:rPr>
+        <w:t>viewInsets</w:t>
+      </w:r>
+      <w:proofErr w:type="spellEnd"/>
+      <w:proofErr w:type="gramEnd"/>
+    </w:p>
+    <w:p>
+      <w:pPr>
+        <w:jc w:val="both"/>
+        <w:rPr>
+          <w:sz w:val="36"/>
+          <w:szCs w:val="36"/>
+        </w:rPr>
+      </w:pPr>
+      <w:r>
+        <w:rPr>
+          <w:sz w:val="36"/>
+          <w:szCs w:val="36"/>
+        </w:rPr>
+        <w:t xml:space="preserve"># When keyboard opens bottom inset becomes greater than 0 and when closed bottom inset is 0. </w:t>
+      </w:r>
+      <w:proofErr w:type="spellStart"/>
+      <w:r>
+        <w:rPr>
+          <w:b/>
+          <w:bCs/>
+          <w:sz w:val="36"/>
+          <w:szCs w:val="36"/>
+        </w:rPr>
+        <w:t>MediaQuery.of</w:t>
+      </w:r>
+      <w:proofErr w:type="spellEnd"/>
+      <w:r>
+        <w:rPr>
+          <w:b/>
+          <w:bCs/>
+          <w:sz w:val="36"/>
+          <w:szCs w:val="36"/>
+        </w:rPr>
+        <w:t>(…</w:t>
+      </w:r>
+      <w:proofErr w:type="gramStart"/>
+      <w:r>
+        <w:rPr>
+          <w:b/>
+          <w:bCs/>
+          <w:sz w:val="36"/>
+          <w:szCs w:val="36"/>
+        </w:rPr>
+        <w:t>).</w:t>
+      </w:r>
+      <w:proofErr w:type="spellStart"/>
+      <w:r>
+        <w:rPr>
+          <w:b/>
+          <w:bCs/>
+          <w:sz w:val="36"/>
+          <w:szCs w:val="36"/>
+        </w:rPr>
+        <w:t>viewInsets</w:t>
+      </w:r>
+      <w:proofErr w:type="spellEnd"/>
+      <w:proofErr w:type="gramEnd"/>
+      <w:r>
+        <w:rPr>
+          <w:sz w:val="36"/>
+          <w:szCs w:val="36"/>
+        </w:rPr>
+        <w:t xml:space="preserve"> gives us the current bottom inset</w:t>
+      </w:r>
+    </w:p>
+    <w:p>
+      <w:pPr>
+        <w:jc w:val="both"/>
+        <w:rPr>
+          <w:sz w:val="36"/>
+          <w:szCs w:val="36"/>
+        </w:rPr>
+      </w:pPr>
+      <w:r>
+        <w:rPr>
+          <w:sz w:val="36"/>
+          <w:szCs w:val="36"/>
+        </w:rPr>
+        <w:t># We can use it like this:</w:t>
+      </w:r>
+    </w:p>
+    <w:p>
+      <w:pPr>
+        <w:jc w:val="both"/>
+        <w:rPr>
+          <w:b/>
+          <w:bCs/>
+          <w:color w:val="D86DCB" w:themeColor="accent5" w:themeTint="99"/>
+          <w:sz w:val="36"/>
+          <w:szCs w:val="36"/>
+        </w:rPr>
+      </w:pPr>
+      <w:r>
+        <w:rPr>
+          <w:b/>
+          <w:bCs/>
+          <w:color w:val="D86DCB" w:themeColor="accent5" w:themeTint="99"/>
+          <w:sz w:val="36"/>
+          <w:szCs w:val="36"/>
+        </w:rPr>
+        <w:lastRenderedPageBreak/>
+        <w:t>…</w:t>
+      </w:r>
+    </w:p>
+    <w:p>
+      <w:pPr>
+        <w:jc w:val="both"/>
+        <w:rPr>
+          <w:b/>
+          <w:bCs/>
+          <w:color w:val="D86DCB" w:themeColor="accent5" w:themeTint="99"/>
+          <w:sz w:val="36"/>
+          <w:szCs w:val="36"/>
+        </w:rPr>
+      </w:pPr>
+      <w:r>
+        <w:rPr>
+          <w:b/>
+          <w:bCs/>
+          <w:color w:val="D86DCB" w:themeColor="accent5" w:themeTint="99"/>
+          <w:sz w:val="36"/>
+          <w:szCs w:val="36"/>
+        </w:rPr>
+        <w:t>@override</w:t>
+      </w:r>
+    </w:p>
+    <w:p>
+      <w:pPr>
+        <w:jc w:val="both"/>
+        <w:rPr>
+          <w:b/>
+          <w:bCs/>
+          <w:color w:val="D86DCB" w:themeColor="accent5" w:themeTint="99"/>
+          <w:sz w:val="36"/>
+          <w:szCs w:val="36"/>
+        </w:rPr>
+      </w:pPr>
+      <w:r>
+        <w:rPr>
+          <w:b/>
+          <w:bCs/>
+          <w:color w:val="D86DCB" w:themeColor="accent5" w:themeTint="99"/>
+          <w:sz w:val="36"/>
+          <w:szCs w:val="36"/>
+        </w:rPr>
+        <w:t xml:space="preserve">Widget </w:t>
+      </w:r>
+      <w:proofErr w:type="gramStart"/>
+      <w:r>
+        <w:rPr>
+          <w:b/>
+          <w:bCs/>
+          <w:color w:val="D86DCB" w:themeColor="accent5" w:themeTint="99"/>
+          <w:sz w:val="36"/>
+          <w:szCs w:val="36"/>
+        </w:rPr>
+        <w:t>build(</w:t>
+      </w:r>
+      <w:proofErr w:type="spellStart"/>
+      <w:proofErr w:type="gramEnd"/>
+      <w:r>
+        <w:rPr>
+          <w:b/>
+          <w:bCs/>
+          <w:color w:val="D86DCB" w:themeColor="accent5" w:themeTint="99"/>
+          <w:sz w:val="36"/>
+          <w:szCs w:val="36"/>
+        </w:rPr>
+        <w:t>BuildContext</w:t>
+      </w:r>
+      <w:proofErr w:type="spellEnd"/>
+      <w:r>
+        <w:rPr>
+          <w:b/>
+          <w:bCs/>
+          <w:color w:val="D86DCB" w:themeColor="accent5" w:themeTint="99"/>
+          <w:sz w:val="36"/>
+          <w:szCs w:val="36"/>
+        </w:rPr>
+        <w:t xml:space="preserve"> context) {</w:t>
+      </w:r>
+    </w:p>
+    <w:p>
+      <w:pPr>
+        <w:jc w:val="both"/>
+        <w:rPr>
+          <w:b/>
+          <w:bCs/>
+          <w:color w:val="D86DCB" w:themeColor="accent5" w:themeTint="99"/>
+          <w:sz w:val="36"/>
+          <w:szCs w:val="36"/>
+        </w:rPr>
+      </w:pPr>
+      <w:r>
+        <w:rPr>
+          <w:b/>
+          <w:bCs/>
+          <w:color w:val="D86DCB" w:themeColor="accent5" w:themeTint="99"/>
+          <w:sz w:val="36"/>
+          <w:szCs w:val="36"/>
+        </w:rPr>
+        <w:t xml:space="preserve">  </w:t>
+      </w:r>
+      <w:r>
+        <w:rPr>
+          <w:b/>
+          <w:bCs/>
+          <w:color w:val="D86DCB" w:themeColor="accent5" w:themeTint="99"/>
+          <w:sz w:val="36"/>
+          <w:szCs w:val="36"/>
+        </w:rPr>
+        <w:t xml:space="preserve">final </w:t>
+      </w:r>
+      <w:r>
+        <w:rPr>
+          <w:b/>
+          <w:bCs/>
+          <w:color w:val="D86DCB" w:themeColor="accent5" w:themeTint="99"/>
+          <w:sz w:val="36"/>
+          <w:szCs w:val="36"/>
+        </w:rPr>
+        <w:t xml:space="preserve">bool </w:t>
+      </w:r>
+      <w:proofErr w:type="spellStart"/>
+      <w:r>
+        <w:rPr>
+          <w:b/>
+          <w:bCs/>
+          <w:color w:val="D86DCB" w:themeColor="accent5" w:themeTint="99"/>
+          <w:sz w:val="36"/>
+          <w:szCs w:val="36"/>
+        </w:rPr>
+        <w:t>keyboardOpen</w:t>
+      </w:r>
+      <w:proofErr w:type="spellEnd"/>
+      <w:r>
+        <w:rPr>
+          <w:b/>
+          <w:bCs/>
+          <w:color w:val="D86DCB" w:themeColor="accent5" w:themeTint="99"/>
+          <w:sz w:val="36"/>
+          <w:szCs w:val="36"/>
+        </w:rPr>
+        <w:t xml:space="preserve"> =</w:t>
+      </w:r>
+    </w:p>
+    <w:p>
+      <w:pPr>
+        <w:jc w:val="both"/>
+        <w:rPr>
+          <w:b/>
+          <w:bCs/>
+          <w:color w:val="D86DCB" w:themeColor="accent5" w:themeTint="99"/>
+          <w:sz w:val="36"/>
+          <w:szCs w:val="36"/>
+        </w:rPr>
+      </w:pPr>
+      <w:r>
+        <w:rPr>
+          <w:b/>
+          <w:bCs/>
+          <w:color w:val="D86DCB" w:themeColor="accent5" w:themeTint="99"/>
+          <w:sz w:val="36"/>
+          <w:szCs w:val="36"/>
+        </w:rPr>
+        <w:t xml:space="preserve">      </w:t>
+      </w:r>
+      <w:proofErr w:type="spellStart"/>
+      <w:r>
+        <w:rPr>
+          <w:b/>
+          <w:bCs/>
+          <w:color w:val="D86DCB" w:themeColor="accent5" w:themeTint="99"/>
+          <w:sz w:val="36"/>
+          <w:szCs w:val="36"/>
+        </w:rPr>
+        <w:t>MediaQuery.of</w:t>
+      </w:r>
+      <w:proofErr w:type="spellEnd"/>
+      <w:r>
+        <w:rPr>
+          <w:b/>
+          <w:bCs/>
+          <w:color w:val="D86DCB" w:themeColor="accent5" w:themeTint="99"/>
+          <w:sz w:val="36"/>
+          <w:szCs w:val="36"/>
+        </w:rPr>
+        <w:t>(context</w:t>
+      </w:r>
+      <w:proofErr w:type="gramStart"/>
+      <w:r>
+        <w:rPr>
+          <w:b/>
+          <w:bCs/>
+          <w:color w:val="D86DCB" w:themeColor="accent5" w:themeTint="99"/>
+          <w:sz w:val="36"/>
+          <w:szCs w:val="36"/>
+        </w:rPr>
+        <w:t>).</w:t>
+      </w:r>
+      <w:proofErr w:type="spellStart"/>
+      <w:r>
+        <w:rPr>
+          <w:b/>
+          <w:bCs/>
+          <w:color w:val="D86DCB" w:themeColor="accent5" w:themeTint="99"/>
+          <w:sz w:val="36"/>
+          <w:szCs w:val="36"/>
+        </w:rPr>
+        <w:t>viewInsets.bottom</w:t>
+      </w:r>
+      <w:proofErr w:type="spellEnd"/>
+      <w:proofErr w:type="gramEnd"/>
+      <w:r>
+        <w:rPr>
+          <w:b/>
+          <w:bCs/>
+          <w:color w:val="D86DCB" w:themeColor="accent5" w:themeTint="99"/>
+          <w:sz w:val="36"/>
+          <w:szCs w:val="36"/>
+        </w:rPr>
+        <w:t xml:space="preserve"> &gt; 0;</w:t>
+      </w:r>
+    </w:p>
+    <w:p>
+      <w:pPr>
+        <w:jc w:val="both"/>
+        <w:rPr>
+          <w:b/>
+          <w:bCs/>
+          <w:color w:val="D86DCB" w:themeColor="accent5" w:themeTint="99"/>
+          <w:sz w:val="36"/>
+          <w:szCs w:val="36"/>
+        </w:rPr>
+      </w:pPr>
+      <w:r>
+        <w:rPr>
+          <w:b/>
+          <w:bCs/>
+          <w:color w:val="D86DCB" w:themeColor="accent5" w:themeTint="99"/>
+          <w:sz w:val="36"/>
+          <w:szCs w:val="36"/>
+        </w:rPr>
+        <w:t xml:space="preserve">  return </w:t>
+      </w:r>
+      <w:proofErr w:type="gramStart"/>
+      <w:r>
+        <w:rPr>
+          <w:b/>
+          <w:bCs/>
+          <w:color w:val="D86DCB" w:themeColor="accent5" w:themeTint="99"/>
+          <w:sz w:val="36"/>
+          <w:szCs w:val="36"/>
+        </w:rPr>
+        <w:t>Scaffold(</w:t>
+      </w:r>
+      <w:proofErr w:type="gramEnd"/>
+    </w:p>
+    <w:p>
+      <w:pPr>
+        <w:jc w:val="both"/>
+        <w:rPr>
+          <w:b/>
+          <w:bCs/>
+          <w:color w:val="D86DCB" w:themeColor="accent5" w:themeTint="99"/>
+          <w:sz w:val="36"/>
+          <w:szCs w:val="36"/>
+        </w:rPr>
+      </w:pPr>
+      <w:r>
+        <w:rPr>
+          <w:b/>
+          <w:bCs/>
+          <w:color w:val="D86DCB" w:themeColor="accent5" w:themeTint="99"/>
+          <w:sz w:val="36"/>
+          <w:szCs w:val="36"/>
+        </w:rPr>
+        <w:t xml:space="preserve">    body: </w:t>
+      </w:r>
+      <w:proofErr w:type="gramStart"/>
+      <w:r>
+        <w:rPr>
+          <w:b/>
+          <w:bCs/>
+          <w:color w:val="D86DCB" w:themeColor="accent5" w:themeTint="99"/>
+          <w:sz w:val="36"/>
+          <w:szCs w:val="36"/>
+        </w:rPr>
+        <w:t>Column(</w:t>
+      </w:r>
+      <w:proofErr w:type="gramEnd"/>
+    </w:p>
+    <w:p>
+      <w:pPr>
+        <w:jc w:val="both"/>
+        <w:rPr>
+          <w:b/>
+          <w:bCs/>
+          <w:color w:val="D86DCB" w:themeColor="accent5" w:themeTint="99"/>
+          <w:sz w:val="36"/>
+          <w:szCs w:val="36"/>
+        </w:rPr>
+      </w:pPr>
+      <w:r>
+        <w:rPr>
+          <w:b/>
+          <w:bCs/>
+          <w:color w:val="D86DCB" w:themeColor="accent5" w:themeTint="99"/>
+          <w:sz w:val="36"/>
+          <w:szCs w:val="36"/>
+        </w:rPr>
+        <w:t xml:space="preserve">      children: [</w:t>
+      </w:r>
+    </w:p>
+    <w:p>
+      <w:pPr>
+        <w:jc w:val="both"/>
+        <w:rPr>
+          <w:b/>
+          <w:bCs/>
+          <w:color w:val="D86DCB" w:themeColor="accent5" w:themeTint="99"/>
+          <w:sz w:val="36"/>
+          <w:szCs w:val="36"/>
+        </w:rPr>
+      </w:pPr>
+      <w:r>
+        <w:rPr>
+          <w:b/>
+          <w:bCs/>
+          <w:color w:val="D86DCB" w:themeColor="accent5" w:themeTint="99"/>
+          <w:sz w:val="36"/>
+          <w:szCs w:val="36"/>
+        </w:rPr>
+        <w:t xml:space="preserve">        </w:t>
+      </w:r>
+      <w:proofErr w:type="spellStart"/>
+      <w:proofErr w:type="gramStart"/>
+      <w:r>
+        <w:rPr>
+          <w:b/>
+          <w:bCs/>
+          <w:color w:val="D86DCB" w:themeColor="accent5" w:themeTint="99"/>
+          <w:sz w:val="36"/>
+          <w:szCs w:val="36"/>
+        </w:rPr>
+        <w:t>TextField</w:t>
+      </w:r>
+      <w:proofErr w:type="spellEnd"/>
+      <w:r>
+        <w:rPr>
+          <w:b/>
+          <w:bCs/>
+          <w:color w:val="D86DCB" w:themeColor="accent5" w:themeTint="99"/>
+          <w:sz w:val="36"/>
+          <w:szCs w:val="36"/>
+        </w:rPr>
+        <w:t>(</w:t>
+      </w:r>
+      <w:proofErr w:type="gramEnd"/>
+      <w:r>
+        <w:rPr>
+          <w:b/>
+          <w:bCs/>
+          <w:color w:val="D86DCB" w:themeColor="accent5" w:themeTint="99"/>
+          <w:sz w:val="36"/>
+          <w:szCs w:val="36"/>
+        </w:rPr>
+        <w:t>),</w:t>
+      </w:r>
+    </w:p>
+    <w:p>
+      <w:pPr>
+        <w:jc w:val="both"/>
+        <w:rPr>
+          <w:b/>
+          <w:bCs/>
+          <w:color w:val="D86DCB" w:themeColor="accent5" w:themeTint="99"/>
+          <w:sz w:val="36"/>
+          <w:szCs w:val="36"/>
+        </w:rPr>
+      </w:pPr>
+      <w:r>
+        <w:rPr>
+          <w:b/>
+          <w:bCs/>
+          <w:color w:val="D86DCB" w:themeColor="accent5" w:themeTint="99"/>
+          <w:sz w:val="36"/>
+          <w:szCs w:val="36"/>
+        </w:rPr>
+        <w:t xml:space="preserve">        if (</w:t>
+      </w:r>
+      <w:proofErr w:type="spellStart"/>
+      <w:r>
+        <w:rPr>
+          <w:b/>
+          <w:bCs/>
+          <w:color w:val="D86DCB" w:themeColor="accent5" w:themeTint="99"/>
+          <w:sz w:val="36"/>
+          <w:szCs w:val="36"/>
+        </w:rPr>
+        <w:t>keyboardOpen</w:t>
+      </w:r>
+      <w:proofErr w:type="spellEnd"/>
+      <w:r>
+        <w:rPr>
+          <w:b/>
+          <w:bCs/>
+          <w:color w:val="D86DCB" w:themeColor="accent5" w:themeTint="99"/>
+          <w:sz w:val="36"/>
+          <w:szCs w:val="36"/>
+        </w:rPr>
+        <w:t>)</w:t>
+      </w:r>
+    </w:p>
+    <w:p>
+      <w:pPr>
+        <w:jc w:val="both"/>
+        <w:rPr>
+          <w:b/>
+          <w:bCs/>
+          <w:color w:val="D86DCB" w:themeColor="accent5" w:themeTint="99"/>
+          <w:sz w:val="36"/>
+          <w:szCs w:val="36"/>
+        </w:rPr>
+      </w:pPr>
+      <w:r>
+        <w:rPr>
+          <w:b/>
+          <w:bCs/>
+          <w:color w:val="D86DCB" w:themeColor="accent5" w:themeTint="99"/>
+          <w:sz w:val="36"/>
+          <w:szCs w:val="36"/>
+        </w:rPr>
+        <w:t xml:space="preserve">          </w:t>
+      </w:r>
+      <w:proofErr w:type="gramStart"/>
+      <w:r>
+        <w:rPr>
+          <w:b/>
+          <w:bCs/>
+          <w:color w:val="D86DCB" w:themeColor="accent5" w:themeTint="99"/>
+          <w:sz w:val="36"/>
+          <w:szCs w:val="36"/>
+        </w:rPr>
+        <w:t>Text(</w:t>
+      </w:r>
+      <w:proofErr w:type="gramEnd"/>
+      <w:r>
+        <w:rPr>
+          <w:b/>
+          <w:bCs/>
+          <w:color w:val="D86DCB" w:themeColor="accent5" w:themeTint="99"/>
+          <w:sz w:val="36"/>
+          <w:szCs w:val="36"/>
+        </w:rPr>
+        <w:t>"Keyboard is open")</w:t>
+      </w:r>
+    </w:p>
+    <w:p>
+      <w:pPr>
+        <w:jc w:val="both"/>
+        <w:rPr>
+          <w:b/>
+          <w:bCs/>
+          <w:color w:val="D86DCB" w:themeColor="accent5" w:themeTint="99"/>
+          <w:sz w:val="36"/>
+          <w:szCs w:val="36"/>
+        </w:rPr>
+      </w:pPr>
+      <w:r>
+        <w:rPr>
+          <w:b/>
+          <w:bCs/>
+          <w:color w:val="D86DCB" w:themeColor="accent5" w:themeTint="99"/>
+          <w:sz w:val="36"/>
+          <w:szCs w:val="36"/>
+        </w:rPr>
+        <w:t xml:space="preserve">      </w:t>
+      </w:r>
+      <w:r>
+        <w:rPr>
+          <w:b/>
+          <w:bCs/>
+          <w:color w:val="D86DCB" w:themeColor="accent5" w:themeTint="99"/>
+          <w:sz w:val="36"/>
+          <w:szCs w:val="36"/>
+        </w:rPr>
+        <w:t>…</w:t>
+      </w:r>
+    </w:p>
+    <w:p>
+      <w:pPr>
+        <w:jc w:val="both"/>
+        <w:rPr>
+          <w:b/>
+          <w:bCs/>
+          <w:color w:val="D86DCB" w:themeColor="accent5" w:themeTint="99"/>
+          <w:sz w:val="36"/>
+          <w:szCs w:val="36"/>
+        </w:rPr>
+      </w:pPr>
+      <w:r>
+        <w:rPr>
+          <w:b/>
+          <w:bCs/>
+          <w:color w:val="D86DCB" w:themeColor="accent5" w:themeTint="99"/>
+          <w:sz w:val="36"/>
+          <w:szCs w:val="36"/>
+        </w:rPr>
+        <w:t>}</w:t>
       </w:r>
     </w:p>
     <w:p>
@@ -20453,773 +21266,845 @@
           <w:sz w:val="36"/>
           <w:szCs w:val="36"/>
         </w:rPr>
-        <w:t>is a widget that places its children in a Row unless they “overflow” the available horizontal space in that case it lays them out in a Column instead. It’s like a smart widget that switches between Row or Column according to need</w:t>
-      </w:r>
-    </w:p>
-    <w:p>
-      <w:pPr>
-        <w:jc w:val="both"/>
-        <w:rPr>
-          <w:sz w:val="36"/>
-          <w:szCs w:val="36"/>
-        </w:rPr>
-      </w:pPr>
-      <w:r>
-        <w:rPr>
+        <w:t xml:space="preserve">is a widget that places its children in a </w:t>
+      </w:r>
+      <w:r>
+        <w:rPr>
+          <w:b/>
+          <w:bCs/>
+          <w:sz w:val="36"/>
+          <w:szCs w:val="36"/>
+        </w:rPr>
+        <w:t>Row</w:t>
+      </w:r>
+      <w:r>
+        <w:rPr>
+          <w:sz w:val="36"/>
+          <w:szCs w:val="36"/>
+        </w:rPr>
+        <w:t xml:space="preserve"> unless they “overflow” the available horizontal space in that case it lays them out in a </w:t>
+      </w:r>
+      <w:r>
+        <w:rPr>
+          <w:b/>
+          <w:bCs/>
+          <w:sz w:val="36"/>
+          <w:szCs w:val="36"/>
+        </w:rPr>
+        <w:t>Column</w:t>
+      </w:r>
+      <w:r>
+        <w:rPr>
+          <w:sz w:val="36"/>
+          <w:szCs w:val="36"/>
+        </w:rPr>
+        <w:t xml:space="preserve"> instead. It’s like a smart widget that switches between</w:t>
+      </w:r>
+      <w:r>
+        <w:rPr>
+          <w:b/>
+          <w:bCs/>
+          <w:sz w:val="36"/>
+          <w:szCs w:val="36"/>
+        </w:rPr>
+        <w:t xml:space="preserve"> Row</w:t>
+      </w:r>
+      <w:r>
+        <w:rPr>
+          <w:sz w:val="36"/>
+          <w:szCs w:val="36"/>
+        </w:rPr>
+        <w:t xml:space="preserve"> or </w:t>
+      </w:r>
+      <w:r>
+        <w:rPr>
+          <w:b/>
+          <w:bCs/>
+          <w:sz w:val="36"/>
+          <w:szCs w:val="36"/>
+        </w:rPr>
+        <w:t>Column</w:t>
+      </w:r>
+      <w:r>
+        <w:rPr>
+          <w:sz w:val="36"/>
+          <w:szCs w:val="36"/>
+        </w:rPr>
+        <w:t xml:space="preserve"> according to need</w:t>
+      </w:r>
+    </w:p>
+    <w:p>
+      <w:pPr>
+        <w:jc w:val="both"/>
+        <w:rPr>
+          <w:sz w:val="36"/>
+          <w:szCs w:val="36"/>
+        </w:rPr>
+      </w:pPr>
+    </w:p>
+    <w:p>
+      <w:pPr>
+        <w:jc w:val="both"/>
+        <w:rPr>
+          <w:sz w:val="36"/>
+          <w:szCs w:val="36"/>
+        </w:rPr>
+      </w:pPr>
+      <w:r>
+        <w:rPr>
+          <w:sz w:val="36"/>
+          <w:szCs w:val="36"/>
+        </w:rPr>
+        <w:t xml:space="preserve">Properties of </w:t>
+      </w:r>
+      <w:proofErr w:type="spellStart"/>
+      <w:r>
+        <w:rPr>
+          <w:sz w:val="36"/>
+          <w:szCs w:val="36"/>
+        </w:rPr>
+        <w:t>OverflowBar</w:t>
+      </w:r>
+      <w:proofErr w:type="spellEnd"/>
+      <w:r>
+        <w:rPr>
+          <w:sz w:val="36"/>
+          <w:szCs w:val="36"/>
+        </w:rPr>
+        <w:t>:</w:t>
+      </w:r>
+    </w:p>
+    <w:p>
+      <w:pPr>
+        <w:jc w:val="both"/>
+        <w:rPr>
+          <w:sz w:val="36"/>
+          <w:szCs w:val="36"/>
+        </w:rPr>
+      </w:pPr>
+      <w:r>
+        <w:rPr>
+          <w:sz w:val="36"/>
+          <w:szCs w:val="36"/>
+        </w:rPr>
+        <w:t xml:space="preserve"># </w:t>
+      </w:r>
+      <w:r>
+        <w:rPr>
+          <w:b/>
+          <w:bCs/>
+          <w:sz w:val="36"/>
+          <w:szCs w:val="36"/>
+        </w:rPr>
+        <w:t>alignment:</w:t>
+      </w:r>
+      <w:r>
+        <w:rPr>
+          <w:sz w:val="36"/>
+          <w:szCs w:val="36"/>
+        </w:rPr>
+        <w:t xml:space="preserve"> d</w:t>
+      </w:r>
+      <w:r>
+        <w:rPr>
+          <w:sz w:val="36"/>
+          <w:szCs w:val="36"/>
+        </w:rPr>
+        <w:t xml:space="preserve">efines the children's horizontal layout according to the same rules as for </w:t>
+      </w:r>
+      <w:proofErr w:type="spellStart"/>
+      <w:r>
+        <w:rPr>
+          <w:b/>
+          <w:bCs/>
+          <w:sz w:val="36"/>
+          <w:szCs w:val="36"/>
+        </w:rPr>
+        <w:t>Row.mainAxisAlignment</w:t>
+      </w:r>
+      <w:proofErr w:type="spellEnd"/>
+      <w:r>
+        <w:rPr>
+          <w:sz w:val="36"/>
+          <w:szCs w:val="36"/>
+        </w:rPr>
+        <w:t>.</w:t>
+      </w:r>
+    </w:p>
+    <w:p>
+      <w:pPr>
+        <w:jc w:val="both"/>
+        <w:rPr>
+          <w:sz w:val="36"/>
+          <w:szCs w:val="36"/>
+        </w:rPr>
+      </w:pPr>
+      <w:r>
+        <w:rPr>
+          <w:sz w:val="36"/>
+          <w:szCs w:val="36"/>
+        </w:rPr>
+        <w:t xml:space="preserve"># </w:t>
+      </w:r>
+      <w:r>
+        <w:rPr>
+          <w:b/>
+          <w:bCs/>
+          <w:sz w:val="36"/>
+          <w:szCs w:val="36"/>
+        </w:rPr>
+        <w:t>children</w:t>
+      </w:r>
+      <w:r>
+        <w:rPr>
+          <w:b/>
+          <w:bCs/>
+          <w:sz w:val="36"/>
+          <w:szCs w:val="36"/>
+        </w:rPr>
+        <w:t>: &lt;Widget&gt; []</w:t>
+      </w:r>
+      <w:r>
+        <w:rPr>
+          <w:sz w:val="36"/>
+          <w:szCs w:val="36"/>
+        </w:rPr>
+        <w:t xml:space="preserve"> t</w:t>
+      </w:r>
+      <w:r>
+        <w:rPr>
+          <w:sz w:val="36"/>
+          <w:szCs w:val="36"/>
+        </w:rPr>
+        <w:t xml:space="preserve">he </w:t>
+      </w:r>
+      <w:r>
+        <w:rPr>
+          <w:sz w:val="36"/>
+          <w:szCs w:val="36"/>
+        </w:rPr>
+        <w:t xml:space="preserve">list of </w:t>
+      </w:r>
+      <w:r>
+        <w:rPr>
+          <w:sz w:val="36"/>
+          <w:szCs w:val="36"/>
+        </w:rPr>
+        <w:t>widgets below this widget in the tree.</w:t>
+      </w:r>
+    </w:p>
+    <w:p>
+      <w:pPr>
+        <w:jc w:val="both"/>
+        <w:rPr>
+          <w:sz w:val="36"/>
+          <w:szCs w:val="36"/>
+        </w:rPr>
+      </w:pPr>
+      <w:r>
+        <w:rPr>
+          <w:sz w:val="36"/>
+          <w:szCs w:val="36"/>
+        </w:rPr>
+        <w:t>#</w:t>
+      </w:r>
+      <w:r>
+        <w:rPr>
+          <w:b/>
+          <w:bCs/>
+          <w:sz w:val="36"/>
+          <w:szCs w:val="36"/>
+        </w:rPr>
+        <w:t>overflowAlignment</w:t>
+      </w:r>
+      <w:r>
+        <w:rPr>
+          <w:b/>
+          <w:bCs/>
+          <w:sz w:val="36"/>
+          <w:szCs w:val="36"/>
+        </w:rPr>
+        <w:t>:</w:t>
+      </w:r>
+      <w:r>
+        <w:rPr>
+          <w:sz w:val="36"/>
+          <w:szCs w:val="36"/>
+        </w:rPr>
+        <w:t xml:space="preserve"> </w:t>
+      </w:r>
+      <w:r>
+        <w:rPr>
+          <w:sz w:val="36"/>
+          <w:szCs w:val="36"/>
+        </w:rPr>
+        <w:t>(</w:t>
+      </w:r>
+      <w:proofErr w:type="spellStart"/>
+      <w:r>
+        <w:rPr>
+          <w:b/>
+          <w:bCs/>
+          <w:sz w:val="36"/>
+          <w:szCs w:val="36"/>
+        </w:rPr>
+        <w:t>OverflowBarAlignment</w:t>
+      </w:r>
+      <w:r>
+        <w:rPr>
+          <w:b/>
+          <w:bCs/>
+          <w:sz w:val="36"/>
+          <w:szCs w:val="36"/>
+        </w:rPr>
+        <w:t>.center</w:t>
+      </w:r>
+      <w:proofErr w:type="spellEnd"/>
+      <w:r>
+        <w:rPr>
+          <w:b/>
+          <w:bCs/>
+          <w:sz w:val="36"/>
+          <w:szCs w:val="36"/>
+        </w:rPr>
+        <w:t>/…</w:t>
+      </w:r>
+      <w:r>
+        <w:rPr>
+          <w:sz w:val="36"/>
+          <w:szCs w:val="36"/>
+        </w:rPr>
+        <w:t>) t</w:t>
+      </w:r>
+      <w:r>
+        <w:rPr>
+          <w:sz w:val="36"/>
+          <w:szCs w:val="36"/>
+        </w:rPr>
+        <w:t>he horizontal alignment of the children within the vertical "overflow" layout.</w:t>
+      </w:r>
+    </w:p>
+    <w:p>
+      <w:pPr>
+        <w:jc w:val="both"/>
+        <w:rPr>
+          <w:sz w:val="36"/>
+          <w:szCs w:val="36"/>
+        </w:rPr>
+      </w:pPr>
+      <w:r>
+        <w:rPr>
+          <w:sz w:val="36"/>
+          <w:szCs w:val="36"/>
+        </w:rPr>
+        <w:t xml:space="preserve"># </w:t>
+      </w:r>
+      <w:proofErr w:type="spellStart"/>
+      <w:r>
+        <w:rPr>
+          <w:b/>
+          <w:bCs/>
+          <w:sz w:val="36"/>
+          <w:szCs w:val="36"/>
+        </w:rPr>
+        <w:t>overflowDirection</w:t>
+      </w:r>
+      <w:proofErr w:type="spellEnd"/>
+      <w:r>
+        <w:rPr>
+          <w:b/>
+          <w:bCs/>
+          <w:sz w:val="36"/>
+          <w:szCs w:val="36"/>
+        </w:rPr>
+        <w:t>:</w:t>
+      </w:r>
+      <w:r>
+        <w:rPr>
+          <w:sz w:val="36"/>
+          <w:szCs w:val="36"/>
+        </w:rPr>
+        <w:t xml:space="preserve"> </w:t>
+      </w:r>
+      <w:r>
+        <w:rPr>
+          <w:sz w:val="36"/>
+          <w:szCs w:val="36"/>
+        </w:rPr>
+        <w:t>d</w:t>
+      </w:r>
+      <w:r>
+        <w:rPr>
+          <w:sz w:val="36"/>
+          <w:szCs w:val="36"/>
+        </w:rPr>
+        <w:t>efines the order that the children appear in, if the horizontal layout overflows.</w:t>
+      </w:r>
+    </w:p>
+    <w:p>
+      <w:pPr>
+        <w:jc w:val="both"/>
+        <w:rPr>
+          <w:sz w:val="36"/>
+          <w:szCs w:val="36"/>
+        </w:rPr>
+      </w:pPr>
+      <w:r>
+        <w:rPr>
+          <w:sz w:val="36"/>
+          <w:szCs w:val="36"/>
+        </w:rPr>
+        <w:t>#</w:t>
+      </w:r>
+      <w:r>
+        <w:rPr>
+          <w:b/>
+          <w:bCs/>
+          <w:sz w:val="36"/>
+          <w:szCs w:val="36"/>
+        </w:rPr>
+        <w:t xml:space="preserve"> </w:t>
+      </w:r>
+      <w:proofErr w:type="spellStart"/>
+      <w:r>
+        <w:rPr>
+          <w:b/>
+          <w:bCs/>
+          <w:sz w:val="36"/>
+          <w:szCs w:val="36"/>
+        </w:rPr>
+        <w:t>overflowSpacing</w:t>
+      </w:r>
+      <w:proofErr w:type="spellEnd"/>
+      <w:r>
+        <w:rPr>
+          <w:b/>
+          <w:bCs/>
+          <w:sz w:val="36"/>
+          <w:szCs w:val="36"/>
+        </w:rPr>
+        <w:t>:</w:t>
+      </w:r>
+      <w:r>
+        <w:rPr>
+          <w:sz w:val="36"/>
+          <w:szCs w:val="36"/>
+        </w:rPr>
+        <w:t xml:space="preserve"> </w:t>
+      </w:r>
+      <w:r>
+        <w:rPr>
+          <w:sz w:val="36"/>
+          <w:szCs w:val="36"/>
+        </w:rPr>
+        <w:t>t</w:t>
+      </w:r>
+      <w:r>
+        <w:rPr>
+          <w:sz w:val="36"/>
+          <w:szCs w:val="36"/>
+        </w:rPr>
+        <w:t>he</w:t>
+      </w:r>
+      <w:r>
+        <w:rPr>
+          <w:sz w:val="36"/>
+          <w:szCs w:val="36"/>
+        </w:rPr>
+        <w:t xml:space="preserve"> </w:t>
+      </w:r>
+      <w:r>
+        <w:rPr>
+          <w:sz w:val="36"/>
+          <w:szCs w:val="36"/>
+        </w:rPr>
+        <w:t>double</w:t>
+      </w:r>
+      <w:r>
+        <w:rPr>
+          <w:sz w:val="36"/>
+          <w:szCs w:val="36"/>
+        </w:rPr>
+        <w:t>,</w:t>
+      </w:r>
+      <w:r>
+        <w:rPr>
+          <w:sz w:val="36"/>
+          <w:szCs w:val="36"/>
+        </w:rPr>
+        <w:t xml:space="preserve"> height of the gap between children in the vertical "overflow" layout.</w:t>
+      </w:r>
+    </w:p>
+    <w:p>
+      <w:pPr>
+        <w:jc w:val="both"/>
+        <w:rPr>
+          <w:sz w:val="36"/>
+          <w:szCs w:val="36"/>
+        </w:rPr>
+      </w:pPr>
+      <w:r>
+        <w:rPr>
+          <w:sz w:val="36"/>
+          <w:szCs w:val="36"/>
+        </w:rPr>
+        <w:t xml:space="preserve"># </w:t>
+      </w:r>
+      <w:r>
+        <w:rPr>
+          <w:b/>
+          <w:bCs/>
+          <w:sz w:val="36"/>
+          <w:szCs w:val="36"/>
+        </w:rPr>
+        <w:t>spacing</w:t>
+      </w:r>
+      <w:r>
+        <w:rPr>
+          <w:b/>
+          <w:bCs/>
+          <w:sz w:val="36"/>
+          <w:szCs w:val="36"/>
+        </w:rPr>
+        <w:t>:</w:t>
+      </w:r>
+      <w:r>
+        <w:rPr>
+          <w:sz w:val="36"/>
+          <w:szCs w:val="36"/>
+        </w:rPr>
+        <w:t xml:space="preserve"> t</w:t>
+      </w:r>
+      <w:r>
+        <w:rPr>
+          <w:sz w:val="36"/>
+          <w:szCs w:val="36"/>
+        </w:rPr>
+        <w:t>he</w:t>
+      </w:r>
+      <w:r>
+        <w:rPr>
+          <w:sz w:val="36"/>
+          <w:szCs w:val="36"/>
+        </w:rPr>
+        <w:t xml:space="preserve"> double,</w:t>
+      </w:r>
+      <w:r>
+        <w:rPr>
+          <w:sz w:val="36"/>
+          <w:szCs w:val="36"/>
+        </w:rPr>
+        <w:t xml:space="preserve"> width of the gap between children for the default horizontal layout.</w:t>
+      </w:r>
+    </w:p>
+    <w:p>
+      <w:pPr>
+        <w:jc w:val="both"/>
+        <w:rPr>
+          <w:sz w:val="36"/>
+          <w:szCs w:val="36"/>
+        </w:rPr>
+      </w:pPr>
+      <w:r>
+        <w:rPr>
+          <w:sz w:val="36"/>
+          <w:szCs w:val="36"/>
+        </w:rPr>
+        <w:t xml:space="preserve"># </w:t>
+      </w:r>
+      <w:proofErr w:type="spellStart"/>
+      <w:r>
+        <w:rPr>
+          <w:b/>
+          <w:bCs/>
+          <w:sz w:val="36"/>
+          <w:szCs w:val="36"/>
+        </w:rPr>
+        <w:t>textDirection</w:t>
+      </w:r>
+      <w:proofErr w:type="spellEnd"/>
+      <w:r>
+        <w:rPr>
+          <w:b/>
+          <w:bCs/>
+          <w:sz w:val="36"/>
+          <w:szCs w:val="36"/>
+        </w:rPr>
+        <w:t>:</w:t>
+      </w:r>
+      <w:r>
+        <w:rPr>
+          <w:sz w:val="36"/>
+          <w:szCs w:val="36"/>
+        </w:rPr>
+        <w:t xml:space="preserve"> d</w:t>
+      </w:r>
+      <w:r>
+        <w:rPr>
+          <w:sz w:val="36"/>
+          <w:szCs w:val="36"/>
+        </w:rPr>
+        <w:t xml:space="preserve">etermines the order that the children appear in for the default horizontal layout, and the interpretation of </w:t>
+      </w:r>
+      <w:proofErr w:type="spellStart"/>
+      <w:r>
+        <w:rPr>
+          <w:b/>
+          <w:bCs/>
+          <w:sz w:val="36"/>
+          <w:szCs w:val="36"/>
+        </w:rPr>
+        <w:t>OverflowBarAlignment.start</w:t>
+      </w:r>
+      <w:proofErr w:type="spellEnd"/>
+      <w:r>
+        <w:rPr>
+          <w:sz w:val="36"/>
+          <w:szCs w:val="36"/>
+        </w:rPr>
+        <w:t xml:space="preserve"> and </w:t>
+      </w:r>
+      <w:proofErr w:type="spellStart"/>
+      <w:r>
+        <w:rPr>
+          <w:b/>
+          <w:bCs/>
+          <w:sz w:val="36"/>
+          <w:szCs w:val="36"/>
+        </w:rPr>
+        <w:t>OverflowBarAlignment.end</w:t>
+      </w:r>
+      <w:proofErr w:type="spellEnd"/>
+      <w:r>
+        <w:rPr>
+          <w:sz w:val="36"/>
+          <w:szCs w:val="36"/>
+        </w:rPr>
+        <w:t xml:space="preserve"> for the vertical overflow layout.</w:t>
+      </w:r>
+    </w:p>
+    <w:p>
+      <w:pPr>
+        <w:jc w:val="both"/>
+        <w:rPr>
+          <w:b/>
+          <w:bCs/>
+          <w:color w:val="D86DCB" w:themeColor="accent5" w:themeTint="99"/>
+          <w:sz w:val="36"/>
+          <w:szCs w:val="36"/>
+        </w:rPr>
+      </w:pPr>
+      <w:proofErr w:type="spellStart"/>
+      <w:proofErr w:type="gramStart"/>
+      <w:r>
+        <w:rPr>
+          <w:b/>
+          <w:bCs/>
+          <w:color w:val="D86DCB" w:themeColor="accent5" w:themeTint="99"/>
+          <w:sz w:val="36"/>
+          <w:szCs w:val="36"/>
+        </w:rPr>
+        <w:t>OverflowBar</w:t>
+      </w:r>
+      <w:proofErr w:type="spellEnd"/>
+      <w:r>
+        <w:rPr>
+          <w:b/>
+          <w:bCs/>
+          <w:color w:val="D86DCB" w:themeColor="accent5" w:themeTint="99"/>
+          <w:sz w:val="36"/>
+          <w:szCs w:val="36"/>
+        </w:rPr>
+        <w:t>(</w:t>
+      </w:r>
+      <w:proofErr w:type="gramEnd"/>
+    </w:p>
+    <w:p>
+      <w:pPr>
+        <w:jc w:val="both"/>
+        <w:rPr>
+          <w:b/>
+          <w:bCs/>
+          <w:color w:val="D86DCB" w:themeColor="accent5" w:themeTint="99"/>
+          <w:sz w:val="36"/>
+          <w:szCs w:val="36"/>
+        </w:rPr>
+      </w:pPr>
+      <w:r>
+        <w:rPr>
+          <w:b/>
+          <w:bCs/>
+          <w:color w:val="D86DCB" w:themeColor="accent5" w:themeTint="99"/>
+          <w:sz w:val="36"/>
+          <w:szCs w:val="36"/>
+        </w:rPr>
+        <w:t xml:space="preserve">      alignment: </w:t>
+      </w:r>
+      <w:proofErr w:type="spellStart"/>
+      <w:r>
+        <w:rPr>
+          <w:b/>
+          <w:bCs/>
+          <w:color w:val="D86DCB" w:themeColor="accent5" w:themeTint="99"/>
+          <w:sz w:val="36"/>
+          <w:szCs w:val="36"/>
+        </w:rPr>
+        <w:t>MainAxisAlignment.center</w:t>
+      </w:r>
+      <w:proofErr w:type="spellEnd"/>
+      <w:r>
+        <w:rPr>
+          <w:b/>
+          <w:bCs/>
+          <w:color w:val="D86DCB" w:themeColor="accent5" w:themeTint="99"/>
+          <w:sz w:val="36"/>
+          <w:szCs w:val="36"/>
+        </w:rPr>
+        <w:t>,</w:t>
+      </w:r>
+    </w:p>
+    <w:p>
+      <w:pPr>
+        <w:jc w:val="both"/>
+        <w:rPr>
+          <w:b/>
+          <w:bCs/>
+          <w:color w:val="D86DCB" w:themeColor="accent5" w:themeTint="99"/>
+          <w:sz w:val="36"/>
+          <w:szCs w:val="36"/>
+        </w:rPr>
+      </w:pPr>
+      <w:r>
+        <w:rPr>
+          <w:b/>
+          <w:bCs/>
+          <w:color w:val="D86DCB" w:themeColor="accent5" w:themeTint="99"/>
+          <w:sz w:val="36"/>
+          <w:szCs w:val="36"/>
+        </w:rPr>
+        <w:t xml:space="preserve">      </w:t>
+      </w:r>
+      <w:proofErr w:type="spellStart"/>
+      <w:r>
+        <w:rPr>
+          <w:b/>
+          <w:bCs/>
+          <w:color w:val="D86DCB" w:themeColor="accent5" w:themeTint="99"/>
+          <w:sz w:val="36"/>
+          <w:szCs w:val="36"/>
+        </w:rPr>
+        <w:t>overflowDirection</w:t>
+      </w:r>
+      <w:proofErr w:type="spellEnd"/>
+      <w:proofErr w:type="gramStart"/>
+      <w:r>
+        <w:rPr>
+          <w:b/>
+          <w:bCs/>
+          <w:color w:val="D86DCB" w:themeColor="accent5" w:themeTint="99"/>
+          <w:sz w:val="36"/>
+          <w:szCs w:val="36"/>
+        </w:rPr>
+        <w:t>: .down</w:t>
+      </w:r>
+      <w:proofErr w:type="gramEnd"/>
+      <w:r>
+        <w:rPr>
+          <w:b/>
+          <w:bCs/>
+          <w:color w:val="D86DCB" w:themeColor="accent5" w:themeTint="99"/>
+          <w:sz w:val="36"/>
+          <w:szCs w:val="36"/>
+        </w:rPr>
+        <w:t>,</w:t>
+      </w:r>
+    </w:p>
+    <w:p>
+      <w:pPr>
+        <w:jc w:val="both"/>
+        <w:rPr>
+          <w:b/>
+          <w:bCs/>
+          <w:color w:val="D86DCB" w:themeColor="accent5" w:themeTint="99"/>
+          <w:sz w:val="36"/>
+          <w:szCs w:val="36"/>
+        </w:rPr>
+      </w:pPr>
+      <w:r>
+        <w:rPr>
+          <w:b/>
+          <w:bCs/>
+          <w:color w:val="D86DCB" w:themeColor="accent5" w:themeTint="99"/>
           <w:sz w:val="36"/>
           <w:szCs w:val="36"/>
         </w:rPr>
         <w:lastRenderedPageBreak/>
-        <w:t xml:space="preserve">Properties of </w:t>
-      </w:r>
-      <w:proofErr w:type="spellStart"/>
-      <w:r>
-        <w:rPr>
-          <w:sz w:val="36"/>
-          <w:szCs w:val="36"/>
-        </w:rPr>
-        <w:t>OverflowBar</w:t>
-      </w:r>
-      <w:proofErr w:type="spellEnd"/>
-      <w:r>
-        <w:rPr>
-          <w:sz w:val="36"/>
-          <w:szCs w:val="36"/>
-        </w:rPr>
-        <w:t>:</w:t>
-      </w:r>
-    </w:p>
-    <w:p>
-      <w:pPr>
-        <w:jc w:val="both"/>
-        <w:rPr>
-          <w:sz w:val="36"/>
-          <w:szCs w:val="36"/>
-        </w:rPr>
-      </w:pPr>
-      <w:r>
-        <w:rPr>
-          <w:sz w:val="36"/>
-          <w:szCs w:val="36"/>
-        </w:rPr>
-        <w:t xml:space="preserve"># </w:t>
-      </w:r>
-      <w:r>
-        <w:rPr>
-          <w:b/>
-          <w:bCs/>
-          <w:sz w:val="36"/>
-          <w:szCs w:val="36"/>
-        </w:rPr>
-        <w:t>alignment:</w:t>
-      </w:r>
-      <w:r>
-        <w:rPr>
-          <w:sz w:val="36"/>
-          <w:szCs w:val="36"/>
-        </w:rPr>
-        <w:t xml:space="preserve"> d</w:t>
-      </w:r>
-      <w:r>
-        <w:rPr>
-          <w:sz w:val="36"/>
-          <w:szCs w:val="36"/>
-        </w:rPr>
-        <w:t xml:space="preserve">efines the children's horizontal layout according to the same rules as for </w:t>
-      </w:r>
-      <w:proofErr w:type="spellStart"/>
-      <w:r>
-        <w:rPr>
-          <w:b/>
-          <w:bCs/>
-          <w:sz w:val="36"/>
-          <w:szCs w:val="36"/>
-        </w:rPr>
-        <w:t>Row.mainAxisAlignment</w:t>
-      </w:r>
-      <w:proofErr w:type="spellEnd"/>
-      <w:r>
-        <w:rPr>
-          <w:sz w:val="36"/>
-          <w:szCs w:val="36"/>
-        </w:rPr>
-        <w:t>.</w:t>
-      </w:r>
-    </w:p>
-    <w:p>
-      <w:pPr>
-        <w:jc w:val="both"/>
-        <w:rPr>
-          <w:sz w:val="36"/>
-          <w:szCs w:val="36"/>
-        </w:rPr>
-      </w:pPr>
-      <w:r>
-        <w:rPr>
-          <w:sz w:val="36"/>
-          <w:szCs w:val="36"/>
-        </w:rPr>
-        <w:t xml:space="preserve"># </w:t>
-      </w:r>
-      <w:r>
-        <w:rPr>
-          <w:b/>
-          <w:bCs/>
-          <w:sz w:val="36"/>
-          <w:szCs w:val="36"/>
-        </w:rPr>
-        <w:t>children</w:t>
-      </w:r>
-      <w:r>
-        <w:rPr>
-          <w:b/>
-          <w:bCs/>
-          <w:sz w:val="36"/>
-          <w:szCs w:val="36"/>
-        </w:rPr>
-        <w:t>: &lt;Widget&gt; []</w:t>
-      </w:r>
-      <w:r>
-        <w:rPr>
-          <w:sz w:val="36"/>
-          <w:szCs w:val="36"/>
-        </w:rPr>
-        <w:t xml:space="preserve"> t</w:t>
-      </w:r>
-      <w:r>
-        <w:rPr>
-          <w:sz w:val="36"/>
-          <w:szCs w:val="36"/>
-        </w:rPr>
-        <w:t xml:space="preserve">he </w:t>
-      </w:r>
-      <w:r>
-        <w:rPr>
-          <w:sz w:val="36"/>
-          <w:szCs w:val="36"/>
-        </w:rPr>
-        <w:t xml:space="preserve">list of </w:t>
-      </w:r>
-      <w:r>
-        <w:rPr>
-          <w:sz w:val="36"/>
-          <w:szCs w:val="36"/>
-        </w:rPr>
-        <w:t>widgets below this widget in the tree.</w:t>
-      </w:r>
-    </w:p>
-    <w:p>
-      <w:pPr>
-        <w:jc w:val="both"/>
-        <w:rPr>
-          <w:sz w:val="36"/>
-          <w:szCs w:val="36"/>
-        </w:rPr>
-      </w:pPr>
-      <w:r>
-        <w:rPr>
-          <w:sz w:val="36"/>
-          <w:szCs w:val="36"/>
-        </w:rPr>
-        <w:t>#</w:t>
-      </w:r>
-      <w:r>
-        <w:rPr>
-          <w:b/>
-          <w:bCs/>
-          <w:sz w:val="36"/>
-          <w:szCs w:val="36"/>
-        </w:rPr>
-        <w:t>overflowAlignment</w:t>
-      </w:r>
-      <w:r>
-        <w:rPr>
-          <w:b/>
-          <w:bCs/>
-          <w:sz w:val="36"/>
-          <w:szCs w:val="36"/>
-        </w:rPr>
-        <w:t>:</w:t>
-      </w:r>
-      <w:r>
-        <w:rPr>
-          <w:sz w:val="36"/>
-          <w:szCs w:val="36"/>
-        </w:rPr>
-        <w:t xml:space="preserve"> </w:t>
-      </w:r>
-      <w:r>
-        <w:rPr>
-          <w:sz w:val="36"/>
-          <w:szCs w:val="36"/>
-        </w:rPr>
-        <w:t>(</w:t>
-      </w:r>
-      <w:proofErr w:type="spellStart"/>
-      <w:r>
-        <w:rPr>
-          <w:b/>
-          <w:bCs/>
-          <w:sz w:val="36"/>
-          <w:szCs w:val="36"/>
-        </w:rPr>
-        <w:t>OverflowBarAlignment</w:t>
-      </w:r>
-      <w:r>
-        <w:rPr>
-          <w:b/>
-          <w:bCs/>
-          <w:sz w:val="36"/>
-          <w:szCs w:val="36"/>
-        </w:rPr>
-        <w:t>.center</w:t>
-      </w:r>
-      <w:proofErr w:type="spellEnd"/>
-      <w:r>
-        <w:rPr>
-          <w:b/>
-          <w:bCs/>
-          <w:sz w:val="36"/>
-          <w:szCs w:val="36"/>
-        </w:rPr>
-        <w:t>/…</w:t>
-      </w:r>
-      <w:r>
-        <w:rPr>
-          <w:sz w:val="36"/>
-          <w:szCs w:val="36"/>
-        </w:rPr>
-        <w:t>) t</w:t>
-      </w:r>
-      <w:r>
-        <w:rPr>
-          <w:sz w:val="36"/>
-          <w:szCs w:val="36"/>
-        </w:rPr>
-        <w:t>he horizontal alignment of the children within the vertical "overflow" layout.</w:t>
-      </w:r>
-    </w:p>
-    <w:p>
-      <w:pPr>
-        <w:jc w:val="both"/>
-        <w:rPr>
-          <w:sz w:val="36"/>
-          <w:szCs w:val="36"/>
-        </w:rPr>
-      </w:pPr>
-      <w:r>
-        <w:rPr>
-          <w:sz w:val="36"/>
-          <w:szCs w:val="36"/>
-        </w:rPr>
-        <w:t xml:space="preserve"># </w:t>
-      </w:r>
-      <w:proofErr w:type="spellStart"/>
-      <w:r>
-        <w:rPr>
-          <w:b/>
-          <w:bCs/>
-          <w:sz w:val="36"/>
-          <w:szCs w:val="36"/>
-        </w:rPr>
-        <w:t>overflowDirection</w:t>
-      </w:r>
-      <w:proofErr w:type="spellEnd"/>
-      <w:r>
-        <w:rPr>
-          <w:b/>
-          <w:bCs/>
-          <w:sz w:val="36"/>
-          <w:szCs w:val="36"/>
-        </w:rPr>
-        <w:t>:</w:t>
-      </w:r>
-      <w:r>
-        <w:rPr>
-          <w:sz w:val="36"/>
-          <w:szCs w:val="36"/>
-        </w:rPr>
-        <w:t xml:space="preserve"> </w:t>
-      </w:r>
-      <w:r>
-        <w:rPr>
-          <w:sz w:val="36"/>
-          <w:szCs w:val="36"/>
-        </w:rPr>
-        <w:t>d</w:t>
-      </w:r>
-      <w:r>
-        <w:rPr>
-          <w:sz w:val="36"/>
-          <w:szCs w:val="36"/>
-        </w:rPr>
-        <w:t>efines the order that the children appear in, if the horizontal layout overflows.</w:t>
-      </w:r>
-    </w:p>
-    <w:p>
-      <w:pPr>
-        <w:jc w:val="both"/>
-        <w:rPr>
-          <w:sz w:val="36"/>
-          <w:szCs w:val="36"/>
-        </w:rPr>
-      </w:pPr>
-      <w:r>
-        <w:rPr>
-          <w:sz w:val="36"/>
-          <w:szCs w:val="36"/>
-        </w:rPr>
-        <w:t>#</w:t>
-      </w:r>
-      <w:r>
-        <w:rPr>
-          <w:b/>
-          <w:bCs/>
-          <w:sz w:val="36"/>
-          <w:szCs w:val="36"/>
-        </w:rPr>
-        <w:t xml:space="preserve"> </w:t>
-      </w:r>
-      <w:proofErr w:type="spellStart"/>
-      <w:r>
-        <w:rPr>
-          <w:b/>
-          <w:bCs/>
-          <w:sz w:val="36"/>
-          <w:szCs w:val="36"/>
-        </w:rPr>
-        <w:t>overflowSpacing</w:t>
-      </w:r>
-      <w:proofErr w:type="spellEnd"/>
-      <w:r>
-        <w:rPr>
-          <w:b/>
-          <w:bCs/>
-          <w:sz w:val="36"/>
-          <w:szCs w:val="36"/>
-        </w:rPr>
-        <w:t>:</w:t>
-      </w:r>
-      <w:r>
-        <w:rPr>
-          <w:sz w:val="36"/>
-          <w:szCs w:val="36"/>
-        </w:rPr>
-        <w:t xml:space="preserve"> </w:t>
-      </w:r>
-      <w:r>
-        <w:rPr>
-          <w:sz w:val="36"/>
-          <w:szCs w:val="36"/>
-        </w:rPr>
-        <w:t>t</w:t>
-      </w:r>
-      <w:r>
-        <w:rPr>
-          <w:sz w:val="36"/>
-          <w:szCs w:val="36"/>
-        </w:rPr>
-        <w:t>he</w:t>
-      </w:r>
-      <w:r>
-        <w:rPr>
-          <w:sz w:val="36"/>
-          <w:szCs w:val="36"/>
-        </w:rPr>
-        <w:t xml:space="preserve"> </w:t>
-      </w:r>
-      <w:r>
-        <w:rPr>
-          <w:sz w:val="36"/>
-          <w:szCs w:val="36"/>
-        </w:rPr>
-        <w:t>double</w:t>
-      </w:r>
-      <w:r>
-        <w:rPr>
+        <w:t xml:space="preserve">      </w:t>
+      </w:r>
+      <w:proofErr w:type="spellStart"/>
+      <w:r>
+        <w:rPr>
+          <w:b/>
+          <w:bCs/>
+          <w:color w:val="D86DCB" w:themeColor="accent5" w:themeTint="99"/>
+          <w:sz w:val="36"/>
+          <w:szCs w:val="36"/>
+        </w:rPr>
+        <w:t>textDirection</w:t>
+      </w:r>
+      <w:proofErr w:type="spellEnd"/>
+      <w:r>
+        <w:rPr>
+          <w:b/>
+          <w:bCs/>
+          <w:color w:val="D86DCB" w:themeColor="accent5" w:themeTint="99"/>
+          <w:sz w:val="36"/>
+          <w:szCs w:val="36"/>
+        </w:rPr>
+        <w:t xml:space="preserve">: </w:t>
+      </w:r>
+      <w:proofErr w:type="spellStart"/>
+      <w:r>
+        <w:rPr>
+          <w:b/>
+          <w:bCs/>
+          <w:color w:val="D86DCB" w:themeColor="accent5" w:themeTint="99"/>
+          <w:sz w:val="36"/>
+          <w:szCs w:val="36"/>
+        </w:rPr>
+        <w:t>TextDirection.ltr</w:t>
+      </w:r>
+      <w:proofErr w:type="spellEnd"/>
+      <w:r>
+        <w:rPr>
+          <w:b/>
+          <w:bCs/>
+          <w:color w:val="D86DCB" w:themeColor="accent5" w:themeTint="99"/>
           <w:sz w:val="36"/>
           <w:szCs w:val="36"/>
         </w:rPr>
         <w:t>,</w:t>
       </w:r>
-      <w:r>
-        <w:rPr>
-          <w:sz w:val="36"/>
-          <w:szCs w:val="36"/>
-        </w:rPr>
-        <w:t xml:space="preserve"> height of the gap between children in the vertical "overflow" layout.</w:t>
-      </w:r>
-    </w:p>
-    <w:p>
-      <w:pPr>
-        <w:jc w:val="both"/>
-        <w:rPr>
-          <w:sz w:val="36"/>
-          <w:szCs w:val="36"/>
-        </w:rPr>
-      </w:pPr>
-      <w:r>
-        <w:rPr>
-          <w:sz w:val="36"/>
-          <w:szCs w:val="36"/>
-        </w:rPr>
-        <w:t xml:space="preserve"># </w:t>
-      </w:r>
-      <w:r>
-        <w:rPr>
-          <w:b/>
-          <w:bCs/>
-          <w:sz w:val="36"/>
-          <w:szCs w:val="36"/>
-        </w:rPr>
-        <w:t>spacing</w:t>
-      </w:r>
-      <w:r>
-        <w:rPr>
-          <w:b/>
-          <w:bCs/>
-          <w:sz w:val="36"/>
-          <w:szCs w:val="36"/>
-        </w:rPr>
-        <w:t>:</w:t>
-      </w:r>
-      <w:r>
-        <w:rPr>
-          <w:sz w:val="36"/>
-          <w:szCs w:val="36"/>
-        </w:rPr>
-        <w:t xml:space="preserve"> t</w:t>
-      </w:r>
-      <w:r>
-        <w:rPr>
-          <w:sz w:val="36"/>
-          <w:szCs w:val="36"/>
-        </w:rPr>
-        <w:t>he</w:t>
-      </w:r>
-      <w:r>
-        <w:rPr>
-          <w:sz w:val="36"/>
-          <w:szCs w:val="36"/>
-        </w:rPr>
-        <w:t xml:space="preserve"> double,</w:t>
-      </w:r>
-      <w:r>
-        <w:rPr>
-          <w:sz w:val="36"/>
-          <w:szCs w:val="36"/>
-        </w:rPr>
-        <w:t xml:space="preserve"> width of the gap between children for the default horizontal layout.</w:t>
-      </w:r>
-    </w:p>
-    <w:p>
-      <w:pPr>
-        <w:jc w:val="both"/>
-        <w:rPr>
-          <w:sz w:val="36"/>
-          <w:szCs w:val="36"/>
-        </w:rPr>
-      </w:pPr>
-      <w:r>
-        <w:rPr>
-          <w:sz w:val="36"/>
-          <w:szCs w:val="36"/>
-        </w:rPr>
-        <w:t xml:space="preserve"># </w:t>
-      </w:r>
-      <w:proofErr w:type="spellStart"/>
-      <w:r>
-        <w:rPr>
-          <w:b/>
-          <w:bCs/>
-          <w:sz w:val="36"/>
-          <w:szCs w:val="36"/>
-        </w:rPr>
-        <w:t>textDirection</w:t>
-      </w:r>
-      <w:proofErr w:type="spellEnd"/>
-      <w:r>
-        <w:rPr>
-          <w:b/>
-          <w:bCs/>
-          <w:sz w:val="36"/>
-          <w:szCs w:val="36"/>
-        </w:rPr>
-        <w:t>:</w:t>
-      </w:r>
-      <w:r>
-        <w:rPr>
-          <w:sz w:val="36"/>
-          <w:szCs w:val="36"/>
-        </w:rPr>
-        <w:t xml:space="preserve"> d</w:t>
-      </w:r>
-      <w:r>
-        <w:rPr>
-          <w:sz w:val="36"/>
-          <w:szCs w:val="36"/>
-        </w:rPr>
-        <w:t xml:space="preserve">etermines the order that the children appear in for the default horizontal layout, and the interpretation of </w:t>
-      </w:r>
-      <w:proofErr w:type="spellStart"/>
-      <w:r>
-        <w:rPr>
-          <w:b/>
-          <w:bCs/>
-          <w:sz w:val="36"/>
-          <w:szCs w:val="36"/>
-        </w:rPr>
-        <w:t>OverflowBarAlignment.start</w:t>
-      </w:r>
-      <w:proofErr w:type="spellEnd"/>
-      <w:r>
-        <w:rPr>
-          <w:sz w:val="36"/>
-          <w:szCs w:val="36"/>
-        </w:rPr>
-        <w:t xml:space="preserve"> and </w:t>
-      </w:r>
-      <w:proofErr w:type="spellStart"/>
-      <w:r>
-        <w:rPr>
-          <w:b/>
-          <w:bCs/>
-          <w:sz w:val="36"/>
-          <w:szCs w:val="36"/>
-        </w:rPr>
-        <w:t>OverflowBarAlignment.end</w:t>
-      </w:r>
-      <w:proofErr w:type="spellEnd"/>
-      <w:r>
-        <w:rPr>
-          <w:sz w:val="36"/>
-          <w:szCs w:val="36"/>
-        </w:rPr>
-        <w:t xml:space="preserve"> for the vertical overflow layout.</w:t>
-      </w:r>
-    </w:p>
-    <w:p>
-      <w:pPr>
-        <w:jc w:val="both"/>
-        <w:rPr>
-          <w:b/>
-          <w:bCs/>
-          <w:color w:val="D86DCB" w:themeColor="accent5" w:themeTint="99"/>
-          <w:sz w:val="36"/>
-          <w:szCs w:val="36"/>
-        </w:rPr>
-      </w:pPr>
-      <w:proofErr w:type="spellStart"/>
-      <w:proofErr w:type="gramStart"/>
-      <w:r>
-        <w:rPr>
-          <w:b/>
-          <w:bCs/>
-          <w:color w:val="D86DCB" w:themeColor="accent5" w:themeTint="99"/>
-          <w:sz w:val="36"/>
-          <w:szCs w:val="36"/>
-        </w:rPr>
-        <w:t>OverflowBar</w:t>
-      </w:r>
-      <w:proofErr w:type="spellEnd"/>
-      <w:r>
-        <w:rPr>
-          <w:b/>
-          <w:bCs/>
-          <w:color w:val="D86DCB" w:themeColor="accent5" w:themeTint="99"/>
-          <w:sz w:val="36"/>
-          <w:szCs w:val="36"/>
-        </w:rPr>
-        <w:t>(</w:t>
-      </w:r>
-      <w:proofErr w:type="gramEnd"/>
-    </w:p>
-    <w:p>
-      <w:pPr>
-        <w:jc w:val="both"/>
-        <w:rPr>
-          <w:b/>
-          <w:bCs/>
-          <w:color w:val="D86DCB" w:themeColor="accent5" w:themeTint="99"/>
-          <w:sz w:val="36"/>
-          <w:szCs w:val="36"/>
-        </w:rPr>
-      </w:pPr>
-      <w:r>
-        <w:rPr>
-          <w:b/>
-          <w:bCs/>
-          <w:color w:val="D86DCB" w:themeColor="accent5" w:themeTint="99"/>
-          <w:sz w:val="36"/>
-          <w:szCs w:val="36"/>
-        </w:rPr>
-        <w:t xml:space="preserve">      alignment: </w:t>
-      </w:r>
-      <w:proofErr w:type="spellStart"/>
-      <w:r>
-        <w:rPr>
-          <w:b/>
-          <w:bCs/>
-          <w:color w:val="D86DCB" w:themeColor="accent5" w:themeTint="99"/>
-          <w:sz w:val="36"/>
-          <w:szCs w:val="36"/>
-        </w:rPr>
-        <w:t>MainAxisAlignment.center</w:t>
-      </w:r>
-      <w:proofErr w:type="spellEnd"/>
-      <w:r>
-        <w:rPr>
-          <w:b/>
-          <w:bCs/>
-          <w:color w:val="D86DCB" w:themeColor="accent5" w:themeTint="99"/>
-          <w:sz w:val="36"/>
-          <w:szCs w:val="36"/>
-        </w:rPr>
-        <w:t>,</w:t>
-      </w:r>
-    </w:p>
-    <w:p>
-      <w:pPr>
-        <w:jc w:val="both"/>
-        <w:rPr>
-          <w:b/>
-          <w:bCs/>
-          <w:color w:val="D86DCB" w:themeColor="accent5" w:themeTint="99"/>
-          <w:sz w:val="36"/>
-          <w:szCs w:val="36"/>
-        </w:rPr>
-      </w:pPr>
-      <w:r>
-        <w:rPr>
-          <w:b/>
-          <w:bCs/>
-          <w:color w:val="D86DCB" w:themeColor="accent5" w:themeTint="99"/>
-          <w:sz w:val="36"/>
-          <w:szCs w:val="36"/>
-        </w:rPr>
-        <w:t xml:space="preserve">      </w:t>
-      </w:r>
-      <w:proofErr w:type="spellStart"/>
-      <w:r>
-        <w:rPr>
-          <w:b/>
-          <w:bCs/>
-          <w:color w:val="D86DCB" w:themeColor="accent5" w:themeTint="99"/>
-          <w:sz w:val="36"/>
-          <w:szCs w:val="36"/>
-        </w:rPr>
-        <w:t>overflowDirection</w:t>
-      </w:r>
-      <w:proofErr w:type="spellEnd"/>
-      <w:proofErr w:type="gramStart"/>
-      <w:r>
-        <w:rPr>
-          <w:b/>
-          <w:bCs/>
-          <w:color w:val="D86DCB" w:themeColor="accent5" w:themeTint="99"/>
-          <w:sz w:val="36"/>
-          <w:szCs w:val="36"/>
-        </w:rPr>
-        <w:t>: .down</w:t>
-      </w:r>
-      <w:proofErr w:type="gramEnd"/>
-      <w:r>
-        <w:rPr>
-          <w:b/>
-          <w:bCs/>
-          <w:color w:val="D86DCB" w:themeColor="accent5" w:themeTint="99"/>
-          <w:sz w:val="36"/>
-          <w:szCs w:val="36"/>
-        </w:rPr>
-        <w:t>,</w:t>
-      </w:r>
-    </w:p>
-    <w:p>
-      <w:pPr>
-        <w:jc w:val="both"/>
-        <w:rPr>
-          <w:b/>
-          <w:bCs/>
-          <w:color w:val="D86DCB" w:themeColor="accent5" w:themeTint="99"/>
-          <w:sz w:val="36"/>
-          <w:szCs w:val="36"/>
-        </w:rPr>
-      </w:pPr>
-      <w:r>
-        <w:rPr>
-          <w:b/>
-          <w:bCs/>
-          <w:color w:val="D86DCB" w:themeColor="accent5" w:themeTint="99"/>
-          <w:sz w:val="36"/>
-          <w:szCs w:val="36"/>
-        </w:rPr>
-        <w:t xml:space="preserve">      </w:t>
-      </w:r>
-      <w:proofErr w:type="spellStart"/>
-      <w:r>
-        <w:rPr>
-          <w:b/>
-          <w:bCs/>
-          <w:color w:val="D86DCB" w:themeColor="accent5" w:themeTint="99"/>
-          <w:sz w:val="36"/>
-          <w:szCs w:val="36"/>
-        </w:rPr>
-        <w:t>textDirection</w:t>
-      </w:r>
-      <w:proofErr w:type="spellEnd"/>
-      <w:r>
-        <w:rPr>
-          <w:b/>
-          <w:bCs/>
-          <w:color w:val="D86DCB" w:themeColor="accent5" w:themeTint="99"/>
-          <w:sz w:val="36"/>
-          <w:szCs w:val="36"/>
-        </w:rPr>
-        <w:t xml:space="preserve">: </w:t>
-      </w:r>
-      <w:proofErr w:type="spellStart"/>
-      <w:r>
-        <w:rPr>
-          <w:b/>
-          <w:bCs/>
-          <w:color w:val="D86DCB" w:themeColor="accent5" w:themeTint="99"/>
-          <w:sz w:val="36"/>
-          <w:szCs w:val="36"/>
-        </w:rPr>
-        <w:t>TextDirection.ltr</w:t>
-      </w:r>
-      <w:proofErr w:type="spellEnd"/>
-      <w:r>
-        <w:rPr>
-          <w:b/>
-          <w:bCs/>
-          <w:color w:val="D86DCB" w:themeColor="accent5" w:themeTint="99"/>
-          <w:sz w:val="36"/>
-          <w:szCs w:val="36"/>
-        </w:rPr>
-        <w:t>,</w:t>
-      </w:r>
-    </w:p>
-    <w:p>
-      <w:pPr>
-        <w:jc w:val="both"/>
-        <w:rPr>
-          <w:b/>
-          <w:bCs/>
-          <w:color w:val="D86DCB" w:themeColor="accent5" w:themeTint="99"/>
-          <w:sz w:val="36"/>
-          <w:szCs w:val="36"/>
-        </w:rPr>
-      </w:pPr>
-      <w:r>
-        <w:rPr>
-          <w:b/>
-          <w:bCs/>
-          <w:color w:val="D86DCB" w:themeColor="accent5" w:themeTint="99"/>
-          <w:sz w:val="36"/>
-          <w:szCs w:val="36"/>
-        </w:rPr>
-        <w:lastRenderedPageBreak/>
+    </w:p>
+    <w:p>
+      <w:pPr>
+        <w:jc w:val="both"/>
+        <w:rPr>
+          <w:b/>
+          <w:bCs/>
+          <w:color w:val="D86DCB" w:themeColor="accent5" w:themeTint="99"/>
+          <w:sz w:val="36"/>
+          <w:szCs w:val="36"/>
+        </w:rPr>
+      </w:pPr>
+      <w:r>
+        <w:rPr>
+          <w:b/>
+          <w:bCs/>
+          <w:color w:val="D86DCB" w:themeColor="accent5" w:themeTint="99"/>
+          <w:sz w:val="36"/>
+          <w:szCs w:val="36"/>
+        </w:rPr>
         <w:t xml:space="preserve">      </w:t>
       </w:r>
       <w:proofErr w:type="spellStart"/>

</xml_diff>